<commit_message>
Update resume to final one-page ATS version (reference (5) layout)
Layout follows the reference resume template; all facts verified against
the data-analytics repository. Adds certificate verification links and
GitLab project links; removes all GitHub references.

Generated with Codebuff 🤖
Co-Authored-By: Codebuff <noreply@codebuff.com>
</commit_message>
<xml_diff>
--- a/Ansh_Thakur_Data_Analyst_Resume.docx
+++ b/Ansh_Thakur_Data_Analyst_Resume.docx
@@ -132,7 +132,121 @@
           <w:b w:val="0"/>
           <w:sz w:val="20"/>
         </w:rPr>
-        <w:t>Entry-level Data Analyst with hands-on experience in Python, SQL, Power BI, and Excel across a Data Analytics internship and two end-to-end analytics projects. Skilled in data cleaning, validation, exploratory analysis, KPI reporting, and business intelligence dashboards — turning raw datasets into clear, actionable business insights, including findings that say what not to do.</w:t>
+        <w:t>Entry-level Data Analyst with hands-on experience in SQL, Python, Power BI, and Excel through a Data Analytics internship and two end-to-end analytics projects. Skilled in data cleaning, validation, exploratory data analysis, KPI reporting, and business intelligence — transforming raw data into clear, actionable business insights.</w:t>
+      </w:r>
+    </w:p>
+    <w:p>
+      <w:pPr>
+        <w:spacing w:after="30" w:before="70"/>
+        <w:pBdr>
+          <w:bottom w:val="single" w:sz="4" w:space="1" w:color="444444"/>
+        </w:pBdr>
+      </w:pPr>
+      <w:r>
+        <w:rPr>
+          <w:b/>
+          <w:color w:val="1F1F1F"/>
+          <w:sz w:val="20"/>
+        </w:rPr>
+        <w:t>EDUCATION</w:t>
+      </w:r>
+    </w:p>
+    <w:p>
+      <w:pPr>
+        <w:tabs>
+          <w:tab w:pos="10512" w:val="right"/>
+        </w:tabs>
+        <w:spacing w:after="5"/>
+      </w:pPr>
+      <w:r>
+        <w:rPr>
+          <w:b/>
+          <w:sz w:val="20"/>
+        </w:rPr>
+        <w:t>Bachelor of Science in Information Technology (B.Sc. IT) | CGPA: 7.26/10</w:t>
+      </w:r>
+      <w:r>
+        <w:rPr>
+          <w:b/>
+          <w:sz w:val="20"/>
+        </w:rPr>
+        <w:t>2022 – 2025</w:t>
+      </w:r>
+      <w:r>
+        <w:rPr>
+          <w:sz w:val="20"/>
+        </w:rPr>
+        <w:tab/>
+      </w:r>
+    </w:p>
+    <w:p>
+      <w:pPr>
+        <w:spacing w:after="30"/>
+      </w:pPr>
+      <w:r>
+        <w:rPr>
+          <w:b w:val="0"/>
+          <w:color w:val="444444"/>
+          <w:sz w:val="20"/>
+        </w:rPr>
+        <w:t>Sardar Patel Mahavidyalaya, Chandrapur — Gondwana University, Maharashtra</w:t>
+      </w:r>
+    </w:p>
+    <w:p>
+      <w:pPr>
+        <w:spacing w:after="30" w:before="70"/>
+        <w:pBdr>
+          <w:bottom w:val="single" w:sz="4" w:space="1" w:color="444444"/>
+        </w:pBdr>
+      </w:pPr>
+      <w:r>
+        <w:rPr>
+          <w:b/>
+          <w:color w:val="1F1F1F"/>
+          <w:sz w:val="20"/>
+        </w:rPr>
+        <w:t>PROFESSIONAL TRAINING</w:t>
+      </w:r>
+    </w:p>
+    <w:p>
+      <w:pPr>
+        <w:tabs>
+          <w:tab w:pos="10512" w:val="right"/>
+        </w:tabs>
+        <w:spacing w:after="5"/>
+      </w:pPr>
+      <w:r>
+        <w:rPr>
+          <w:b/>
+          <w:sz w:val="20"/>
+        </w:rPr>
+        <w:t>Data Science &amp; Analytics</w:t>
+      </w:r>
+      <w:r>
+        <w:rPr>
+          <w:b/>
+          <w:sz w:val="20"/>
+        </w:rPr>
+        <w:t>Jun 2025 – Nov 2025</w:t>
+      </w:r>
+      <w:r>
+        <w:rPr>
+          <w:sz w:val="20"/>
+        </w:rPr>
+        <w:tab/>
+      </w:r>
+    </w:p>
+    <w:p>
+      <w:pPr>
+        <w:spacing w:after="30"/>
+      </w:pPr>
+      <w:r>
+        <w:rPr>
+          <w:b w:val="0"/>
+          <w:color w:val="444444"/>
+          <w:sz w:val="20"/>
+        </w:rPr>
+        <w:t>Digital Edify Institute, Hyderabad</w:t>
       </w:r>
     </w:p>
     <w:p>
@@ -160,7 +274,7 @@
           <w:b/>
           <w:sz w:val="20"/>
         </w:rPr>
-        <w:t xml:space="preserve">Languages &amp; Databases: </w:t>
+        <w:t xml:space="preserve">Programming &amp; SQL: </w:t>
       </w:r>
       <w:r>
         <w:rPr>
@@ -179,14 +293,14 @@
           <w:b/>
           <w:sz w:val="20"/>
         </w:rPr>
-        <w:t xml:space="preserve">BI &amp; Visualization: </w:t>
+        <w:t xml:space="preserve">Data Analysis: </w:t>
       </w:r>
       <w:r>
         <w:rPr>
           <w:b w:val="0"/>
           <w:sz w:val="20"/>
         </w:rPr>
-        <w:t>Power BI (DAX, Power Query), Excel (Pivot Tables, Charts), Matplotlib, Seaborn, Plotly</w:t>
+        <w:t>Data Cleaning, Data Validation, Data Preprocessing, Data Wrangling, Exploratory Data Analysis, Statistical Analysis, KPI Reporting, Data Visualization, Business Intelligence, Business Understanding, Problem Solving</w:t>
       </w:r>
     </w:p>
     <w:p>
@@ -198,14 +312,14 @@
           <w:b/>
           <w:sz w:val="20"/>
         </w:rPr>
-        <w:t xml:space="preserve">Data Libraries: </w:t>
+        <w:t xml:space="preserve">Libraries: </w:t>
       </w:r>
       <w:r>
         <w:rPr>
           <w:b w:val="0"/>
           <w:sz w:val="20"/>
         </w:rPr>
-        <w:t>Pandas, NumPy, Scikit-learn</w:t>
+        <w:t>Pandas, NumPy, Matplotlib, Seaborn, Plotly, Scikit-learn</w:t>
       </w:r>
     </w:p>
     <w:p>
@@ -217,14 +331,14 @@
           <w:b/>
           <w:sz w:val="20"/>
         </w:rPr>
-        <w:t xml:space="preserve">Developer Tools: </w:t>
+        <w:t xml:space="preserve">BI: </w:t>
       </w:r>
       <w:r>
         <w:rPr>
           <w:b w:val="0"/>
           <w:sz w:val="20"/>
         </w:rPr>
-        <w:t>Jupyter Notebook, Google Colab, Git, GitLab</w:t>
+        <w:t>Power BI, Excel</w:t>
       </w:r>
     </w:p>
     <w:p>
@@ -236,14 +350,14 @@
           <w:b/>
           <w:sz w:val="20"/>
         </w:rPr>
-        <w:t xml:space="preserve">Analytical: </w:t>
+        <w:t xml:space="preserve">Tools: </w:t>
       </w:r>
       <w:r>
         <w:rPr>
           <w:b w:val="0"/>
           <w:sz w:val="20"/>
         </w:rPr>
-        <w:t>Data Cleaning, Data Validation, EDA, Statistical Analysis, KPI Reporting, Business Intelligence, Data Visualization, Business Understanding, Problem Solving</w:t>
+        <w:t>Jupyter Notebook, Google Colab, VS Code, Git, GitLab</w:t>
       </w:r>
     </w:p>
     <w:p>
@@ -265,7 +379,7 @@
     <w:p>
       <w:pPr>
         <w:tabs>
-          <w:tab w:pos="10800" w:val="right"/>
+          <w:tab w:pos="10512" w:val="right"/>
         </w:tabs>
         <w:spacing w:after="5"/>
       </w:pPr>
@@ -361,7 +475,7 @@
     <w:p>
       <w:pPr>
         <w:tabs>
-          <w:tab w:pos="10800" w:val="right"/>
+          <w:tab w:pos="10512" w:val="right"/>
         </w:tabs>
         <w:spacing w:after="5"/>
       </w:pPr>
@@ -374,16 +488,16 @@
       </w:r>
       <w:r>
         <w:rPr>
-          <w:sz w:val="20"/>
-        </w:rPr>
-        <w:tab/>
-      </w:r>
-      <w:r>
-        <w:rPr>
           <w:b/>
           <w:sz w:val="20"/>
         </w:rPr>
         <w:t>Sep 2025</w:t>
+      </w:r>
+      <w:r>
+        <w:rPr>
+          <w:sz w:val="20"/>
+        </w:rPr>
+        <w:tab/>
       </w:r>
     </w:p>
     <w:p>
@@ -396,7 +510,7 @@
           <w:b w:val="0"/>
           <w:sz w:val="20"/>
         </w:rPr>
-        <w:t>Analyzed 7,991 orders across 47 SKUs with Python, Pandas, and MySQL, engineering delivery and margin metrics ($82.7M revenue, $30.9M profit).</w:t>
+        <w:t>Analyzed 7,991 orders across 47 SKUs with Python, Pandas, and SQL/MySQL, engineering delivery and margin metrics ($82.7M revenue, $30.9M profit).</w:t>
       </w:r>
     </w:p>
     <w:p>
@@ -422,7 +536,7 @@
           <w:b w:val="0"/>
           <w:sz w:val="20"/>
         </w:rPr>
-        <w:t>Segmented the catalogue with ABC classification and built an automated interactive Excel dashboard for stakeholder filtering.</w:t>
+        <w:t>Segmented the 47-SKU catalogue with ABC classification and built an automated interactive Excel dashboard for stakeholder filtering.</w:t>
       </w:r>
     </w:p>
     <w:p>
@@ -451,7 +565,7 @@
     <w:p>
       <w:pPr>
         <w:tabs>
-          <w:tab w:pos="10800" w:val="right"/>
+          <w:tab w:pos="10512" w:val="right"/>
         </w:tabs>
         <w:spacing w:after="5"/>
       </w:pPr>
@@ -464,16 +578,16 @@
       </w:r>
       <w:r>
         <w:rPr>
-          <w:sz w:val="20"/>
-        </w:rPr>
-        <w:tab/>
-      </w:r>
-      <w:r>
-        <w:rPr>
           <w:b/>
           <w:sz w:val="20"/>
         </w:rPr>
         <w:t>Aug 2025</w:t>
+      </w:r>
+      <w:r>
+        <w:rPr>
+          <w:sz w:val="20"/>
+        </w:rPr>
+        <w:tab/>
       </w:r>
     </w:p>
     <w:p>
@@ -551,104 +665,6 @@
           <w:color w:val="1F1F1F"/>
           <w:sz w:val="20"/>
         </w:rPr>
-        <w:t>EDUCATION</w:t>
-      </w:r>
-    </w:p>
-    <w:p>
-      <w:pPr>
-        <w:tabs>
-          <w:tab w:pos="10800" w:val="right"/>
-        </w:tabs>
-        <w:spacing w:after="5"/>
-      </w:pPr>
-      <w:r>
-        <w:rPr>
-          <w:b/>
-          <w:sz w:val="20"/>
-        </w:rPr>
-        <w:t>Bachelor of Science in Information Technology (B.Sc. IT) | CGPA: 7.26/10</w:t>
-      </w:r>
-      <w:r>
-        <w:rPr>
-          <w:b/>
-          <w:sz w:val="20"/>
-        </w:rPr>
-        <w:t>2022 – 2025</w:t>
-      </w:r>
-      <w:r>
-        <w:rPr>
-          <w:sz w:val="20"/>
-        </w:rPr>
-        <w:tab/>
-      </w:r>
-    </w:p>
-    <w:p>
-      <w:pPr>
-        <w:spacing w:after="30"/>
-      </w:pPr>
-      <w:r>
-        <w:rPr>
-          <w:b w:val="0"/>
-          <w:color w:val="444444"/>
-          <w:sz w:val="20"/>
-        </w:rPr>
-        <w:t>Sardar Patel Mahavidyalaya, Chandrapur — Gondwana University, Maharashtra</w:t>
-      </w:r>
-    </w:p>
-    <w:p>
-      <w:pPr>
-        <w:tabs>
-          <w:tab w:pos="10800" w:val="right"/>
-        </w:tabs>
-        <w:spacing w:after="5"/>
-      </w:pPr>
-      <w:r>
-        <w:rPr>
-          <w:b/>
-          <w:sz w:val="20"/>
-        </w:rPr>
-        <w:t>Professional Training: Data Science &amp; Analytics</w:t>
-      </w:r>
-      <w:r>
-        <w:rPr>
-          <w:b/>
-          <w:sz w:val="20"/>
-        </w:rPr>
-        <w:t>Jun 2025 – Nov 2025</w:t>
-      </w:r>
-      <w:r>
-        <w:rPr>
-          <w:sz w:val="20"/>
-        </w:rPr>
-        <w:tab/>
-      </w:r>
-    </w:p>
-    <w:p>
-      <w:pPr>
-        <w:spacing w:after="30"/>
-      </w:pPr>
-      <w:r>
-        <w:rPr>
-          <w:b w:val="0"/>
-          <w:color w:val="444444"/>
-          <w:sz w:val="20"/>
-        </w:rPr>
-        <w:t>Digital Edify Institute, Hyderabad</w:t>
-      </w:r>
-    </w:p>
-    <w:p>
-      <w:pPr>
-        <w:spacing w:after="30" w:before="70"/>
-        <w:pBdr>
-          <w:bottom w:val="single" w:sz="4" w:space="1" w:color="444444"/>
-        </w:pBdr>
-      </w:pPr>
-      <w:r>
-        <w:rPr>
-          <w:b/>
-          <w:color w:val="1F1F1F"/>
-          <w:sz w:val="20"/>
-        </w:rPr>
         <w:t>CERTIFICATIONS</w:t>
       </w:r>
     </w:p>
@@ -662,8 +678,19 @@
           <w:b w:val="0"/>
           <w:sz w:val="20"/>
         </w:rPr>
-        <w:t>Deloitte Data Analytics Job Simulation — Forage</w:t>
+        <w:t xml:space="preserve">Deloitte Data Analytics Job Simulation — Forage | </w:t>
       </w:r>
+      <w:hyperlink r:id="rId15">
+        <w:r>
+          <w:rPr>
+            <w:color w:val="0563C1"/>
+            <w:u w:val="single"/>
+            <w:sz w:val="20"/>
+            <w:szCs w:val="20"/>
+          </w:rPr>
+          <w:t xml:space="preserve">Certificate</w:t>
+        </w:r>
+      </w:hyperlink>
     </w:p>
     <w:p>
       <w:pPr>
@@ -675,8 +702,19 @@
           <w:b w:val="0"/>
           <w:sz w:val="20"/>
         </w:rPr>
-        <w:t>Tata GenAI Powered Data Analytics Job Simulation — Forage</w:t>
+        <w:t xml:space="preserve">Tata GenAI Powered Data Analytics Job Simulation — Forage | </w:t>
       </w:r>
+      <w:hyperlink r:id="rId16">
+        <w:r>
+          <w:rPr>
+            <w:color w:val="0563C1"/>
+            <w:u w:val="single"/>
+            <w:sz w:val="20"/>
+            <w:szCs w:val="20"/>
+          </w:rPr>
+          <w:t xml:space="preserve">Certificate</w:t>
+        </w:r>
+      </w:hyperlink>
     </w:p>
     <w:p>
       <w:pPr>
@@ -688,8 +726,19 @@
           <w:b w:val="0"/>
           <w:sz w:val="20"/>
         </w:rPr>
-        <w:t>British Airways Data Science Job Simulation — Forage</w:t>
+        <w:t xml:space="preserve">British Airways Data Science Job Simulation — Forage | </w:t>
       </w:r>
+      <w:hyperlink r:id="rId17">
+        <w:r>
+          <w:rPr>
+            <w:color w:val="0563C1"/>
+            <w:u w:val="single"/>
+            <w:sz w:val="20"/>
+            <w:szCs w:val="20"/>
+          </w:rPr>
+          <w:t xml:space="preserve">Certificate</w:t>
+        </w:r>
+      </w:hyperlink>
     </w:p>
     <w:p>
       <w:pPr>
@@ -719,7 +768,7 @@
           <w:b w:val="0"/>
           <w:sz w:val="16"/>
         </w:rPr>
-        <w:t xml:space="preserve">   |   Portfolio: </w:t>
+        <w:t xml:space="preserve">  |  Portfolio: </w:t>
       </w:r>
       <w:hyperlink r:id="rId11">
         <w:r>
@@ -737,9 +786,9 @@
           <w:b w:val="0"/>
           <w:sz w:val="16"/>
         </w:rPr>
-        <w:t xml:space="preserve">   |   Data Analytics: </w:t>
+        <w:t xml:space="preserve">  |  Data Analytics: </w:t>
       </w:r>
-      <w:hyperlink r:id="rId15">
+      <w:hyperlink r:id="rId18">
         <w:r>
           <w:rPr>
             <w:color w:val="0563C1"/>
@@ -750,10 +799,28 @@
           <w:t xml:space="preserve">gitlab.com/ansht_121/data-analytics</w:t>
         </w:r>
       </w:hyperlink>
+      <w:r>
+        <w:rPr>
+          <w:b w:val="0"/>
+          <w:sz w:val="16"/>
+        </w:rPr>
+        <w:t xml:space="preserve">  |  Portfolio Repo: </w:t>
+      </w:r>
+      <w:hyperlink r:id="rId19">
+        <w:r>
+          <w:rPr>
+            <w:color w:val="0563C1"/>
+            <w:u w:val="single"/>
+            <w:sz w:val="16"/>
+            <w:szCs w:val="16"/>
+          </w:rPr>
+          <w:t xml:space="preserve">gitlab.com/ansht_121/ansh-thakur-portfolio</w:t>
+        </w:r>
+      </w:hyperlink>
     </w:p>
     <w:sectPr>
       <w:pgSz w:w="12240" w:h="15840"/>
-      <w:pgMar w:top="346" w:right="605" w:bottom="346" w:left="605" w:header="720" w:footer="720" w:gutter="0"/>
+      <w:pgMar w:top="576" w:right="720" w:bottom="576" w:left="720" w:header="720" w:footer="720" w:gutter="0"/>
       <w:cols w:space="720"/>
       <w:docGrid w:linePitch="360"/>
     </w:sectPr>

</xml_diff>

<commit_message>
Update resume: final one-page ATS version (reference DOCX layout)
Layout and section hierarchy follow the reference resume; all facts
verified against the data-analytics repository. Skills-first order,
certification dates, and GitLab-only links.

Generated with Codebuff 🤖
Co-Authored-By: Codebuff <noreply@codebuff.com>
</commit_message>
<xml_diff>
--- a/Ansh_Thakur_Data_Analyst_Resume.docx
+++ b/Ansh_Thakur_Data_Analyst_Resume.docx
@@ -39,7 +39,7 @@
           <w:b w:val="0"/>
           <w:sz w:val="18"/>
         </w:rPr>
-        <w:t xml:space="preserve">Chandrapur, Maharashtra, India | 9665895546 | </w:t>
+        <w:t xml:space="preserve">Chandrapur, Maharashtra, India | 9665895546 | ansht1194@gmail.com | </w:t>
       </w:r>
       <w:hyperlink r:id="rId9">
         <w:r>
@@ -88,28 +88,10 @@
           <w:t xml:space="preserve">Portfolio</w:t>
         </w:r>
       </w:hyperlink>
-      <w:r>
-        <w:rPr>
-          <w:b w:val="0"/>
-          <w:sz w:val="18"/>
-        </w:rPr>
-        <w:t xml:space="preserve"> | </w:t>
-      </w:r>
-      <w:hyperlink r:id="rId12">
-        <w:r>
-          <w:rPr>
-            <w:color w:val="0563C1"/>
-            <w:u w:val="single"/>
-            <w:sz w:val="18"/>
-            <w:szCs w:val="18"/>
-          </w:rPr>
-          <w:t xml:space="preserve">Email</w:t>
-        </w:r>
-      </w:hyperlink>
     </w:p>
     <w:p>
       <w:pPr>
-        <w:spacing w:after="30" w:before="70"/>
+        <w:spacing w:after="30" w:before="60"/>
         <w:pBdr>
           <w:bottom w:val="single" w:sz="4" w:space="1" w:color="444444"/>
         </w:pBdr>
@@ -132,12 +114,462 @@
           <w:b w:val="0"/>
           <w:sz w:val="20"/>
         </w:rPr>
-        <w:t>Entry-level Data Analyst with hands-on experience in SQL, Python, Power BI, and Excel through a Data Analytics internship and two end-to-end analytics projects. Skilled in data cleaning, validation, exploratory data analysis, KPI reporting, and business intelligence — transforming raw data into clear, actionable business insights.</w:t>
+        <w:t>Entry-level Data Analyst with hands-on experience in Python, SQL, MySQL, Power BI, and Excel through a Data Analytics internship and two end-to-end analytics projects. Skilled in data cleaning, validation, exploratory data analysis, KPI reporting, and business intelligence — turning raw data into clear, actionable business insights.</w:t>
       </w:r>
     </w:p>
     <w:p>
       <w:pPr>
-        <w:spacing w:after="30" w:before="70"/>
+        <w:spacing w:after="30" w:before="60"/>
+        <w:pBdr>
+          <w:bottom w:val="single" w:sz="4" w:space="1" w:color="444444"/>
+        </w:pBdr>
+      </w:pPr>
+      <w:r>
+        <w:rPr>
+          <w:b/>
+          <w:color w:val="1F1F1F"/>
+          <w:sz w:val="20"/>
+        </w:rPr>
+        <w:t>TECHNICAL SKILLS</w:t>
+      </w:r>
+    </w:p>
+    <w:p>
+      <w:pPr>
+        <w:spacing w:after="15"/>
+      </w:pPr>
+      <w:r>
+        <w:rPr>
+          <w:b/>
+          <w:sz w:val="20"/>
+        </w:rPr>
+        <w:t xml:space="preserve">Programming: </w:t>
+      </w:r>
+      <w:r>
+        <w:rPr>
+          <w:b w:val="0"/>
+          <w:sz w:val="20"/>
+        </w:rPr>
+        <w:t>Python, SQL</w:t>
+      </w:r>
+    </w:p>
+    <w:p>
+      <w:pPr>
+        <w:spacing w:after="15"/>
+      </w:pPr>
+      <w:r>
+        <w:rPr>
+          <w:b/>
+          <w:sz w:val="20"/>
+        </w:rPr>
+        <w:t xml:space="preserve">Databases: </w:t>
+      </w:r>
+      <w:r>
+        <w:rPr>
+          <w:b w:val="0"/>
+          <w:sz w:val="20"/>
+        </w:rPr>
+        <w:t>MySQL</w:t>
+      </w:r>
+    </w:p>
+    <w:p>
+      <w:pPr>
+        <w:spacing w:after="15"/>
+      </w:pPr>
+      <w:r>
+        <w:rPr>
+          <w:b/>
+          <w:sz w:val="20"/>
+        </w:rPr>
+        <w:t xml:space="preserve">Data Analysis: </w:t>
+      </w:r>
+      <w:r>
+        <w:rPr>
+          <w:b w:val="0"/>
+          <w:sz w:val="20"/>
+        </w:rPr>
+        <w:t>Data Cleaning, Data Preprocessing, Data Wrangling, Exploratory Data Analysis, Statistical Analysis, Anomaly Detection, Data Validation, Data Quality Checks</w:t>
+      </w:r>
+    </w:p>
+    <w:p>
+      <w:pPr>
+        <w:spacing w:after="15"/>
+      </w:pPr>
+      <w:r>
+        <w:rPr>
+          <w:b/>
+          <w:sz w:val="20"/>
+        </w:rPr>
+        <w:t xml:space="preserve">Libraries: </w:t>
+      </w:r>
+      <w:r>
+        <w:rPr>
+          <w:b w:val="0"/>
+          <w:sz w:val="20"/>
+        </w:rPr>
+        <w:t>Pandas, NumPy, Matplotlib, Seaborn, Plotly, Scikit-learn</w:t>
+      </w:r>
+    </w:p>
+    <w:p>
+      <w:pPr>
+        <w:spacing w:after="15"/>
+      </w:pPr>
+      <w:r>
+        <w:rPr>
+          <w:b/>
+          <w:sz w:val="20"/>
+        </w:rPr>
+        <w:t xml:space="preserve">BI &amp; Visualization: </w:t>
+      </w:r>
+      <w:r>
+        <w:rPr>
+          <w:b w:val="0"/>
+          <w:sz w:val="20"/>
+        </w:rPr>
+        <w:t>Power BI, Excel</w:t>
+      </w:r>
+    </w:p>
+    <w:p>
+      <w:pPr>
+        <w:spacing w:after="15"/>
+      </w:pPr>
+      <w:r>
+        <w:rPr>
+          <w:b/>
+          <w:sz w:val="20"/>
+        </w:rPr>
+        <w:t xml:space="preserve">Tools: </w:t>
+      </w:r>
+      <w:r>
+        <w:rPr>
+          <w:b w:val="0"/>
+          <w:sz w:val="20"/>
+        </w:rPr>
+        <w:t>Jupyter Notebook, Google Colab, VS Code, Git, GitLab</w:t>
+      </w:r>
+    </w:p>
+    <w:p>
+      <w:pPr>
+        <w:spacing w:after="30" w:before="60"/>
+        <w:pBdr>
+          <w:bottom w:val="single" w:sz="4" w:space="1" w:color="444444"/>
+        </w:pBdr>
+      </w:pPr>
+      <w:r>
+        <w:rPr>
+          <w:b/>
+          <w:color w:val="1F1F1F"/>
+          <w:sz w:val="20"/>
+        </w:rPr>
+        <w:t>DATA ANALYSIS SKILLS</w:t>
+      </w:r>
+    </w:p>
+    <w:p>
+      <w:pPr>
+        <w:spacing w:after="30"/>
+      </w:pPr>
+      <w:r>
+        <w:rPr>
+          <w:b w:val="0"/>
+          <w:sz w:val="20"/>
+        </w:rPr>
+        <w:t>Large Dataset Analysis, Anomaly &amp; Pattern Detection, Data Validation, Data Quality Checks, SQL Querying, Exploratory Data Analysis, Root Cause Analysis, Trend &amp; Insight Generation, Technical Documentation, Analytical Problem Solving, Cross-functional Collaboration.</w:t>
+      </w:r>
+    </w:p>
+    <w:p>
+      <w:pPr>
+        <w:spacing w:after="30" w:before="60"/>
+        <w:pBdr>
+          <w:bottom w:val="single" w:sz="4" w:space="1" w:color="444444"/>
+        </w:pBdr>
+      </w:pPr>
+      <w:r>
+        <w:rPr>
+          <w:b/>
+          <w:color w:val="1F1F1F"/>
+          <w:sz w:val="20"/>
+        </w:rPr>
+        <w:t>INTERNSHIP EXPERIENCE</w:t>
+      </w:r>
+    </w:p>
+    <w:p>
+      <w:pPr>
+        <w:tabs>
+          <w:tab w:pos="10512" w:val="right"/>
+        </w:tabs>
+        <w:spacing w:after="5"/>
+      </w:pPr>
+      <w:r>
+        <w:rPr>
+          <w:b/>
+          <w:sz w:val="20"/>
+        </w:rPr>
+        <w:t>Data Analytics Intern | Unified Mentor Pvt. Ltd.</w:t>
+      </w:r>
+      <w:r>
+        <w:rPr>
+          <w:b/>
+          <w:sz w:val="20"/>
+        </w:rPr>
+        <w:t>Sep 2025 – Dec 2025</w:t>
+      </w:r>
+      <w:r>
+        <w:rPr>
+          <w:sz w:val="20"/>
+        </w:rPr>
+        <w:tab/>
+      </w:r>
+    </w:p>
+    <w:p>
+      <w:pPr>
+        <w:pStyle w:val="ListBullet"/>
+        <w:spacing w:after="15"/>
+      </w:pPr>
+      <w:r>
+        <w:rPr>
+          <w:b w:val="0"/>
+          <w:sz w:val="20"/>
+        </w:rPr>
+        <w:t>Performed data cleaning, transformation, and validation on large datasets using Python (Pandas) and Excel.</w:t>
+      </w:r>
+    </w:p>
+    <w:p>
+      <w:pPr>
+        <w:pStyle w:val="ListBullet"/>
+        <w:spacing w:after="15"/>
+      </w:pPr>
+      <w:r>
+        <w:rPr>
+          <w:b w:val="0"/>
+          <w:sz w:val="20"/>
+        </w:rPr>
+        <w:t>Built automated reporting workflows and KPI dashboards for business stakeholders.</w:t>
+      </w:r>
+    </w:p>
+    <w:p>
+      <w:pPr>
+        <w:pStyle w:val="ListBullet"/>
+        <w:spacing w:after="15"/>
+      </w:pPr>
+      <w:r>
+        <w:rPr>
+          <w:b w:val="0"/>
+          <w:sz w:val="20"/>
+        </w:rPr>
+        <w:t>Applied SQL for data extraction, multi-table joins, subqueries, and window functions.</w:t>
+      </w:r>
+    </w:p>
+    <w:p>
+      <w:pPr>
+        <w:pStyle w:val="ListBullet"/>
+        <w:spacing w:after="15"/>
+      </w:pPr>
+      <w:r>
+        <w:rPr>
+          <w:b w:val="0"/>
+          <w:sz w:val="20"/>
+        </w:rPr>
+        <w:t>Developed Power BI dashboards with DAX measures for executive reporting.</w:t>
+      </w:r>
+    </w:p>
+    <w:p>
+      <w:pPr>
+        <w:spacing w:after="30" w:before="60"/>
+        <w:pBdr>
+          <w:bottom w:val="single" w:sz="4" w:space="1" w:color="444444"/>
+        </w:pBdr>
+      </w:pPr>
+      <w:r>
+        <w:rPr>
+          <w:b/>
+          <w:color w:val="1F1F1F"/>
+          <w:sz w:val="20"/>
+        </w:rPr>
+        <w:t>TECHNICAL PROJECTS</w:t>
+      </w:r>
+    </w:p>
+    <w:p>
+      <w:pPr>
+        <w:tabs>
+          <w:tab w:pos="10512" w:val="right"/>
+        </w:tabs>
+        <w:spacing w:after="5"/>
+      </w:pPr>
+      <w:r>
+        <w:rPr>
+          <w:b/>
+          <w:sz w:val="20"/>
+        </w:rPr>
+        <w:t>Supply Chain Performance Analysis</w:t>
+      </w:r>
+      <w:r>
+        <w:rPr>
+          <w:b/>
+          <w:sz w:val="20"/>
+        </w:rPr>
+        <w:t>Sep 2025</w:t>
+      </w:r>
+      <w:r>
+        <w:rPr>
+          <w:sz w:val="20"/>
+        </w:rPr>
+        <w:tab/>
+      </w:r>
+    </w:p>
+    <w:p>
+      <w:pPr>
+        <w:pStyle w:val="ListBullet"/>
+        <w:spacing w:after="15"/>
+      </w:pPr>
+      <w:r>
+        <w:rPr>
+          <w:b w:val="0"/>
+          <w:sz w:val="20"/>
+        </w:rPr>
+        <w:t>Analyzed 7,991 orders across 47 SKUs with Python, Pandas, and SQL/MySQL, engineering delivery and margin metrics ($82.7M revenue, $30.9M profit).</w:t>
+      </w:r>
+    </w:p>
+    <w:p>
+      <w:pPr>
+        <w:pStyle w:val="ListBullet"/>
+        <w:spacing w:after="15"/>
+      </w:pPr>
+      <w:r>
+        <w:rPr>
+          <w:b w:val="0"/>
+          <w:sz w:val="20"/>
+        </w:rPr>
+        <w:t>Proved late delivery is systemic — only 0.08% of delivery-time variance is between warehouses — preventing a misdirected per-site fix.</w:t>
+      </w:r>
+    </w:p>
+    <w:p>
+      <w:pPr>
+        <w:pStyle w:val="ListBullet"/>
+        <w:spacing w:after="15"/>
+      </w:pPr>
+      <w:r>
+        <w:rPr>
+          <w:b w:val="0"/>
+          <w:sz w:val="20"/>
+        </w:rPr>
+        <w:t>Segmented the 47-SKU catalogue with ABC classification and built an automated interactive Excel dashboard for stakeholder filtering.</w:t>
+      </w:r>
+    </w:p>
+    <w:p>
+      <w:pPr>
+        <w:spacing w:after="20"/>
+      </w:pPr>
+      <w:r>
+        <w:rPr>
+          <w:b w:val="0"/>
+          <w:sz w:val="18"/>
+        </w:rPr>
+        <w:t xml:space="preserve">GitLab Repository: </w:t>
+      </w:r>
+      <w:hyperlink r:id="rId12">
+        <w:r>
+          <w:rPr>
+            <w:color w:val="0563C1"/>
+            <w:u w:val="single"/>
+            <w:sz w:val="18"/>
+            <w:szCs w:val="18"/>
+          </w:rPr>
+          <w:t xml:space="preserve">gitlab.com/ansht_121/data-analytics/-/tree/main/supply-chain-performance-analysis</w:t>
+        </w:r>
+      </w:hyperlink>
+    </w:p>
+    <w:p>
+      <w:pPr>
+        <w:tabs>
+          <w:tab w:pos="10512" w:val="right"/>
+        </w:tabs>
+        <w:spacing w:after="5"/>
+      </w:pPr>
+      <w:r>
+        <w:rPr>
+          <w:b/>
+          <w:sz w:val="20"/>
+        </w:rPr>
+        <w:t>Uber Trip Demand Analysis</w:t>
+      </w:r>
+      <w:r>
+        <w:rPr>
+          <w:b/>
+          <w:sz w:val="20"/>
+        </w:rPr>
+        <w:t>Aug 2025</w:t>
+      </w:r>
+      <w:r>
+        <w:rPr>
+          <w:sz w:val="20"/>
+        </w:rPr>
+        <w:tab/>
+      </w:r>
+    </w:p>
+    <w:p>
+      <w:pPr>
+        <w:pStyle w:val="ListBullet"/>
+        <w:spacing w:after="15"/>
+      </w:pPr>
+      <w:r>
+        <w:rPr>
+          <w:b w:val="0"/>
+          <w:sz w:val="20"/>
+        </w:rPr>
+        <w:t>Analyzed 35,000 trip records in MySQL and Python, profiling demand timing, fares, revenue, and vehicle economics across hours, zones, and airport trips.</w:t>
+      </w:r>
+    </w:p>
+    <w:p>
+      <w:pPr>
+        <w:pStyle w:val="ListBullet"/>
+        <w:spacing w:after="15"/>
+      </w:pPr>
+      <w:r>
+        <w:rPr>
+          <w:b w:val="0"/>
+          <w:sz w:val="20"/>
+        </w:rPr>
+        <w:t>Quantified peak demand (5–7 PM carries 31.2% of trips) and airport economics (39.6% of volume, 54.8% of revenue) to guide surge pricing and fleet allocation.</w:t>
+      </w:r>
+    </w:p>
+    <w:p>
+      <w:pPr>
+        <w:pStyle w:val="ListBullet"/>
+        <w:spacing w:after="15"/>
+      </w:pPr>
+      <w:r>
+        <w:rPr>
+          <w:b w:val="0"/>
+          <w:sz w:val="20"/>
+        </w:rPr>
+        <w:t>Benchmarked fare and vehicle economics (premium earns 2.8× more per km) and built Power BI and Excel dashboards for KPI monitoring.</w:t>
+      </w:r>
+    </w:p>
+    <w:p>
+      <w:pPr>
+        <w:spacing w:after="20"/>
+      </w:pPr>
+      <w:r>
+        <w:rPr>
+          <w:b w:val="0"/>
+          <w:sz w:val="18"/>
+        </w:rPr>
+        <w:t xml:space="preserve">GitLab Repository: </w:t>
+      </w:r>
+      <w:hyperlink r:id="rId13">
+        <w:r>
+          <w:rPr>
+            <w:color w:val="0563C1"/>
+            <w:u w:val="single"/>
+            <w:sz w:val="18"/>
+            <w:szCs w:val="18"/>
+          </w:rPr>
+          <w:t xml:space="preserve">gitlab.com/ansht_121/data-analytics/-/tree/main/uber-trip-demand-analysis</w:t>
+        </w:r>
+      </w:hyperlink>
+    </w:p>
+    <w:p>
+      <w:pPr>
+        <w:spacing w:after="30" w:before="60"/>
         <w:pBdr>
           <w:bottom w:val="single" w:sz="4" w:space="1" w:color="444444"/>
         </w:pBdr>
@@ -170,7 +602,7 @@
           <w:b/>
           <w:sz w:val="20"/>
         </w:rPr>
-        <w:t>2022 – 2025</w:t>
+        <w:t>Jul 2022 – May 2025</w:t>
       </w:r>
       <w:r>
         <w:rPr>
@@ -194,7 +626,7 @@
     </w:p>
     <w:p>
       <w:pPr>
-        <w:spacing w:after="30" w:before="70"/>
+        <w:spacing w:after="30" w:before="60"/>
         <w:pBdr>
           <w:bottom w:val="single" w:sz="4" w:space="1" w:color="444444"/>
         </w:pBdr>
@@ -246,415 +678,12 @@
           <w:color w:val="444444"/>
           <w:sz w:val="20"/>
         </w:rPr>
-        <w:t>Digital Edify Institute, Hyderabad</w:t>
+        <w:t>Digital Edify Institute, Hyderabad, Telangana</w:t>
       </w:r>
     </w:p>
     <w:p>
       <w:pPr>
-        <w:spacing w:after="30" w:before="70"/>
-        <w:pBdr>
-          <w:bottom w:val="single" w:sz="4" w:space="1" w:color="444444"/>
-        </w:pBdr>
-      </w:pPr>
-      <w:r>
-        <w:rPr>
-          <w:b/>
-          <w:color w:val="1F1F1F"/>
-          <w:sz w:val="20"/>
-        </w:rPr>
-        <w:t>TECHNICAL SKILLS</w:t>
-      </w:r>
-    </w:p>
-    <w:p>
-      <w:pPr>
-        <w:spacing w:after="20"/>
-      </w:pPr>
-      <w:r>
-        <w:rPr>
-          <w:b/>
-          <w:sz w:val="20"/>
-        </w:rPr>
-        <w:t xml:space="preserve">Programming &amp; SQL: </w:t>
-      </w:r>
-      <w:r>
-        <w:rPr>
-          <w:b w:val="0"/>
-          <w:sz w:val="20"/>
-        </w:rPr>
-        <w:t>Python, SQL, MySQL</w:t>
-      </w:r>
-    </w:p>
-    <w:p>
-      <w:pPr>
-        <w:spacing w:after="20"/>
-      </w:pPr>
-      <w:r>
-        <w:rPr>
-          <w:b/>
-          <w:sz w:val="20"/>
-        </w:rPr>
-        <w:t xml:space="preserve">Data Analysis: </w:t>
-      </w:r>
-      <w:r>
-        <w:rPr>
-          <w:b w:val="0"/>
-          <w:sz w:val="20"/>
-        </w:rPr>
-        <w:t>Data Cleaning, Data Validation, Data Preprocessing, Data Wrangling, Exploratory Data Analysis, Statistical Analysis, KPI Reporting, Data Visualization, Business Intelligence, Business Understanding, Problem Solving</w:t>
-      </w:r>
-    </w:p>
-    <w:p>
-      <w:pPr>
-        <w:spacing w:after="20"/>
-      </w:pPr>
-      <w:r>
-        <w:rPr>
-          <w:b/>
-          <w:sz w:val="20"/>
-        </w:rPr>
-        <w:t xml:space="preserve">Libraries: </w:t>
-      </w:r>
-      <w:r>
-        <w:rPr>
-          <w:b w:val="0"/>
-          <w:sz w:val="20"/>
-        </w:rPr>
-        <w:t>Pandas, NumPy, Matplotlib, Seaborn, Plotly, Scikit-learn</w:t>
-      </w:r>
-    </w:p>
-    <w:p>
-      <w:pPr>
-        <w:spacing w:after="20"/>
-      </w:pPr>
-      <w:r>
-        <w:rPr>
-          <w:b/>
-          <w:sz w:val="20"/>
-        </w:rPr>
-        <w:t xml:space="preserve">BI: </w:t>
-      </w:r>
-      <w:r>
-        <w:rPr>
-          <w:b w:val="0"/>
-          <w:sz w:val="20"/>
-        </w:rPr>
-        <w:t>Power BI, Excel</w:t>
-      </w:r>
-    </w:p>
-    <w:p>
-      <w:pPr>
-        <w:spacing w:after="20"/>
-      </w:pPr>
-      <w:r>
-        <w:rPr>
-          <w:b/>
-          <w:sz w:val="20"/>
-        </w:rPr>
-        <w:t xml:space="preserve">Tools: </w:t>
-      </w:r>
-      <w:r>
-        <w:rPr>
-          <w:b w:val="0"/>
-          <w:sz w:val="20"/>
-        </w:rPr>
-        <w:t>Jupyter Notebook, Google Colab, VS Code, Git, GitLab</w:t>
-      </w:r>
-    </w:p>
-    <w:p>
-      <w:pPr>
-        <w:spacing w:after="30" w:before="70"/>
-        <w:pBdr>
-          <w:bottom w:val="single" w:sz="4" w:space="1" w:color="444444"/>
-        </w:pBdr>
-      </w:pPr>
-      <w:r>
-        <w:rPr>
-          <w:b/>
-          <w:color w:val="1F1F1F"/>
-          <w:sz w:val="20"/>
-        </w:rPr>
-        <w:t>EXPERIENCE</w:t>
-      </w:r>
-    </w:p>
-    <w:p>
-      <w:pPr>
-        <w:tabs>
-          <w:tab w:pos="10512" w:val="right"/>
-        </w:tabs>
-        <w:spacing w:after="5"/>
-      </w:pPr>
-      <w:r>
-        <w:rPr>
-          <w:b/>
-          <w:sz w:val="20"/>
-        </w:rPr>
-        <w:t>Data Analytics Intern | Unified Mentor Pvt. Ltd.</w:t>
-      </w:r>
-      <w:r>
-        <w:rPr>
-          <w:b/>
-          <w:sz w:val="20"/>
-        </w:rPr>
-        <w:t>Sep 2025 – Dec 2025</w:t>
-      </w:r>
-      <w:r>
-        <w:rPr>
-          <w:sz w:val="20"/>
-        </w:rPr>
-        <w:tab/>
-      </w:r>
-    </w:p>
-    <w:p>
-      <w:pPr>
-        <w:pStyle w:val="ListBullet"/>
-        <w:spacing w:after="20"/>
-      </w:pPr>
-      <w:r>
-        <w:rPr>
-          <w:b w:val="0"/>
-          <w:sz w:val="20"/>
-        </w:rPr>
-        <w:t>Performed data cleaning, transformation, and validation on large datasets using Python (Pandas) and Excel.</w:t>
-      </w:r>
-    </w:p>
-    <w:p>
-      <w:pPr>
-        <w:pStyle w:val="ListBullet"/>
-        <w:spacing w:after="20"/>
-      </w:pPr>
-      <w:r>
-        <w:rPr>
-          <w:b w:val="0"/>
-          <w:sz w:val="20"/>
-        </w:rPr>
-        <w:t>Built automated reporting workflows and KPI dashboards for business stakeholders.</w:t>
-      </w:r>
-    </w:p>
-    <w:p>
-      <w:pPr>
-        <w:pStyle w:val="ListBullet"/>
-        <w:spacing w:after="20"/>
-      </w:pPr>
-      <w:r>
-        <w:rPr>
-          <w:b w:val="0"/>
-          <w:sz w:val="20"/>
-        </w:rPr>
-        <w:t>Applied SQL for data extraction, multi-table joins, subqueries, and window functions.</w:t>
-      </w:r>
-    </w:p>
-    <w:p>
-      <w:pPr>
-        <w:pStyle w:val="ListBullet"/>
-        <w:spacing w:after="20"/>
-      </w:pPr>
-      <w:r>
-        <w:rPr>
-          <w:b w:val="0"/>
-          <w:sz w:val="20"/>
-        </w:rPr>
-        <w:t>Developed Power BI dashboards with DAX measures for executive reporting.</w:t>
-      </w:r>
-    </w:p>
-    <w:p>
-      <w:pPr>
-        <w:spacing w:after="30" w:before="70"/>
-        <w:pBdr>
-          <w:bottom w:val="single" w:sz="4" w:space="1" w:color="444444"/>
-        </w:pBdr>
-      </w:pPr>
-      <w:r>
-        <w:rPr>
-          <w:b/>
-          <w:color w:val="1F1F1F"/>
-          <w:sz w:val="20"/>
-        </w:rPr>
-        <w:t>PROJECTS</w:t>
-      </w:r>
-    </w:p>
-    <w:p>
-      <w:pPr>
-        <w:tabs>
-          <w:tab w:pos="10512" w:val="right"/>
-        </w:tabs>
-        <w:spacing w:after="5"/>
-      </w:pPr>
-      <w:r>
-        <w:rPr>
-          <w:b/>
-          <w:sz w:val="20"/>
-        </w:rPr>
-        <w:t>Supply Chain Performance Analysis</w:t>
-      </w:r>
-      <w:r>
-        <w:rPr>
-          <w:b/>
-          <w:sz w:val="20"/>
-        </w:rPr>
-        <w:t>Sep 2025</w:t>
-      </w:r>
-      <w:r>
-        <w:rPr>
-          <w:sz w:val="20"/>
-        </w:rPr>
-        <w:tab/>
-      </w:r>
-    </w:p>
-    <w:p>
-      <w:pPr>
-        <w:pStyle w:val="ListBullet"/>
-        <w:spacing w:after="20"/>
-      </w:pPr>
-      <w:r>
-        <w:rPr>
-          <w:b w:val="0"/>
-          <w:sz w:val="20"/>
-        </w:rPr>
-        <w:t>Analyzed 7,991 orders across 47 SKUs with Python, Pandas, and SQL/MySQL, engineering delivery and margin metrics ($82.7M revenue, $30.9M profit).</w:t>
-      </w:r>
-    </w:p>
-    <w:p>
-      <w:pPr>
-        <w:pStyle w:val="ListBullet"/>
-        <w:spacing w:after="20"/>
-      </w:pPr>
-      <w:r>
-        <w:rPr>
-          <w:b w:val="0"/>
-          <w:sz w:val="20"/>
-        </w:rPr>
-        <w:t>Proved late delivery is systemic — only 0.08% of delivery-time variance is between warehouses — preventing a misdirected per-site fix.</w:t>
-      </w:r>
-    </w:p>
-    <w:p>
-      <w:pPr>
-        <w:pStyle w:val="ListBullet"/>
-        <w:spacing w:after="20"/>
-      </w:pPr>
-      <w:r>
-        <w:rPr>
-          <w:b w:val="0"/>
-          <w:sz w:val="20"/>
-        </w:rPr>
-        <w:t>Segmented the 47-SKU catalogue with ABC classification and built an automated interactive Excel dashboard for stakeholder filtering.</w:t>
-      </w:r>
-    </w:p>
-    <w:p>
-      <w:pPr>
-        <w:spacing w:after="20"/>
-      </w:pPr>
-      <w:r>
-        <w:rPr>
-          <w:b w:val="0"/>
-          <w:sz w:val="18"/>
-        </w:rPr>
-        <w:t xml:space="preserve">GitLab Repository: </w:t>
-      </w:r>
-      <w:hyperlink r:id="rId13">
-        <w:r>
-          <w:rPr>
-            <w:color w:val="0563C1"/>
-            <w:u w:val="single"/>
-            <w:sz w:val="18"/>
-            <w:szCs w:val="18"/>
-          </w:rPr>
-          <w:t xml:space="preserve">gitlab.com/ansht_121/data-analytics/-/tree/main/supply-chain-performance-analysis</w:t>
-        </w:r>
-      </w:hyperlink>
-    </w:p>
-    <w:p>
-      <w:pPr>
-        <w:tabs>
-          <w:tab w:pos="10512" w:val="right"/>
-        </w:tabs>
-        <w:spacing w:after="5"/>
-      </w:pPr>
-      <w:r>
-        <w:rPr>
-          <w:b/>
-          <w:sz w:val="20"/>
-        </w:rPr>
-        <w:t>Uber Trip Demand Analysis</w:t>
-      </w:r>
-      <w:r>
-        <w:rPr>
-          <w:b/>
-          <w:sz w:val="20"/>
-        </w:rPr>
-        <w:t>Aug 2025</w:t>
-      </w:r>
-      <w:r>
-        <w:rPr>
-          <w:sz w:val="20"/>
-        </w:rPr>
-        <w:tab/>
-      </w:r>
-    </w:p>
-    <w:p>
-      <w:pPr>
-        <w:pStyle w:val="ListBullet"/>
-        <w:spacing w:after="20"/>
-      </w:pPr>
-      <w:r>
-        <w:rPr>
-          <w:b w:val="0"/>
-          <w:sz w:val="20"/>
-        </w:rPr>
-        <w:t>Analyzed 35,000 trip records in MySQL and Python, profiling demand timing, fares, revenue, and vehicle economics across hours, zones, and airport trips.</w:t>
-      </w:r>
-    </w:p>
-    <w:p>
-      <w:pPr>
-        <w:pStyle w:val="ListBullet"/>
-        <w:spacing w:after="20"/>
-      </w:pPr>
-      <w:r>
-        <w:rPr>
-          <w:b w:val="0"/>
-          <w:sz w:val="20"/>
-        </w:rPr>
-        <w:t>Quantified peak demand (5–7 PM carries 31.2% of trips) and airport economics (39.6% of volume, 54.8% of revenue) to guide surge pricing and fleet allocation.</w:t>
-      </w:r>
-    </w:p>
-    <w:p>
-      <w:pPr>
-        <w:pStyle w:val="ListBullet"/>
-        <w:spacing w:after="20"/>
-      </w:pPr>
-      <w:r>
-        <w:rPr>
-          <w:b w:val="0"/>
-          <w:sz w:val="20"/>
-        </w:rPr>
-        <w:t>Benchmarked fare and vehicle economics (premium earns 2.8× more per km) and built Power BI and Excel dashboards for KPI monitoring.</w:t>
-      </w:r>
-    </w:p>
-    <w:p>
-      <w:pPr>
-        <w:spacing w:after="20"/>
-      </w:pPr>
-      <w:r>
-        <w:rPr>
-          <w:b w:val="0"/>
-          <w:sz w:val="18"/>
-        </w:rPr>
-        <w:t xml:space="preserve">GitLab Repository: </w:t>
-      </w:r>
-      <w:hyperlink r:id="rId14">
-        <w:r>
-          <w:rPr>
-            <w:color w:val="0563C1"/>
-            <w:u w:val="single"/>
-            <w:sz w:val="18"/>
-            <w:szCs w:val="18"/>
-          </w:rPr>
-          <w:t xml:space="preserve">gitlab.com/ansht_121/data-analytics/-/tree/main/uber-trip-demand-analysis</w:t>
-        </w:r>
-      </w:hyperlink>
-    </w:p>
-    <w:p>
-      <w:pPr>
-        <w:spacing w:after="30" w:before="70"/>
+        <w:spacing w:after="30" w:before="60"/>
         <w:pBdr>
           <w:bottom w:val="single" w:sz="4" w:space="1" w:color="444444"/>
         </w:pBdr>
@@ -671,14 +700,38 @@
     <w:p>
       <w:pPr>
         <w:pStyle w:val="ListBullet"/>
-        <w:spacing w:after="20"/>
+        <w:spacing w:after="15"/>
       </w:pPr>
       <w:r>
         <w:rPr>
           <w:b w:val="0"/>
           <w:sz w:val="20"/>
         </w:rPr>
-        <w:t xml:space="preserve">Deloitte Data Analytics Job Simulation — Forage | </w:t>
+        <w:t xml:space="preserve">Deloitte Data Analytics Job Simulation — Forage — Jun 2025 | </w:t>
+      </w:r>
+      <w:hyperlink r:id="rId14">
+        <w:r>
+          <w:rPr>
+            <w:color w:val="0563C1"/>
+            <w:u w:val="single"/>
+            <w:sz w:val="20"/>
+            <w:szCs w:val="20"/>
+          </w:rPr>
+          <w:t xml:space="preserve">Certificate</w:t>
+        </w:r>
+      </w:hyperlink>
+    </w:p>
+    <w:p>
+      <w:pPr>
+        <w:pStyle w:val="ListBullet"/>
+        <w:spacing w:after="15"/>
+      </w:pPr>
+      <w:r>
+        <w:rPr>
+          <w:b w:val="0"/>
+          <w:sz w:val="20"/>
+        </w:rPr>
+        <w:t xml:space="preserve">Tata GenAI Powered Data Analytics Job Simulation — Forage — Jul 2025 | </w:t>
       </w:r>
       <w:hyperlink r:id="rId15">
         <w:r>
@@ -695,14 +748,14 @@
     <w:p>
       <w:pPr>
         <w:pStyle w:val="ListBullet"/>
-        <w:spacing w:after="20"/>
+        <w:spacing w:after="15"/>
       </w:pPr>
       <w:r>
         <w:rPr>
           <w:b w:val="0"/>
           <w:sz w:val="20"/>
         </w:rPr>
-        <w:t xml:space="preserve">Tata GenAI Powered Data Analytics Job Simulation — Forage | </w:t>
+        <w:t xml:space="preserve">British Airways Data Science Job Simulation — Forage — Aug 2025 | </w:t>
       </w:r>
       <w:hyperlink r:id="rId16">
         <w:r>
@@ -718,31 +771,7 @@
     </w:p>
     <w:p>
       <w:pPr>
-        <w:pStyle w:val="ListBullet"/>
-        <w:spacing w:after="20"/>
-      </w:pPr>
-      <w:r>
-        <w:rPr>
-          <w:b w:val="0"/>
-          <w:sz w:val="20"/>
-        </w:rPr>
-        <w:t xml:space="preserve">British Airways Data Science Job Simulation — Forage | </w:t>
-      </w:r>
-      <w:hyperlink r:id="rId17">
-        <w:r>
-          <w:rPr>
-            <w:color w:val="0563C1"/>
-            <w:u w:val="single"/>
-            <w:sz w:val="20"/>
-            <w:szCs w:val="20"/>
-          </w:rPr>
-          <w:t xml:space="preserve">Certificate</w:t>
-        </w:r>
-      </w:hyperlink>
-    </w:p>
-    <w:p>
-      <w:pPr>
-        <w:spacing w:after="0" w:before="60"/>
+        <w:spacing w:after="0" w:before="40"/>
         <w:jc w:val="center"/>
       </w:pPr>
       <w:r>
@@ -779,42 +808,6 @@
             <w:szCs w:val="16"/>
           </w:rPr>
           <w:t xml:space="preserve">ansh-thakur.netlify.app</w:t>
-        </w:r>
-      </w:hyperlink>
-      <w:r>
-        <w:rPr>
-          <w:b w:val="0"/>
-          <w:sz w:val="16"/>
-        </w:rPr>
-        <w:t xml:space="preserve">  |  Data Analytics: </w:t>
-      </w:r>
-      <w:hyperlink r:id="rId18">
-        <w:r>
-          <w:rPr>
-            <w:color w:val="0563C1"/>
-            <w:u w:val="single"/>
-            <w:sz w:val="16"/>
-            <w:szCs w:val="16"/>
-          </w:rPr>
-          <w:t xml:space="preserve">gitlab.com/ansht_121/data-analytics</w:t>
-        </w:r>
-      </w:hyperlink>
-      <w:r>
-        <w:rPr>
-          <w:b w:val="0"/>
-          <w:sz w:val="16"/>
-        </w:rPr>
-        <w:t xml:space="preserve">  |  Portfolio Repo: </w:t>
-      </w:r>
-      <w:hyperlink r:id="rId19">
-        <w:r>
-          <w:rPr>
-            <w:color w:val="0563C1"/>
-            <w:u w:val="single"/>
-            <w:sz w:val="16"/>
-            <w:szCs w:val="16"/>
-          </w:rPr>
-          <w:t xml:space="preserve">gitlab.com/ansht_121/ansh-thakur-portfolio</w:t>
         </w:r>
       </w:hyperlink>
     </w:p>

</xml_diff>

<commit_message>
fix: remove old portfolio link and duplicate bottom GitLab/Portfolio links from resume
</commit_message>
<xml_diff>
--- a/Ansh_Thakur_Data_Analyst_Resume.docx
+++ b/Ansh_Thakur_Data_Analyst_Resume.docx
@@ -77,17 +77,6 @@
         </w:rPr>
         <w:t xml:space="preserve"> | </w:t>
       </w:r>
-      <w:hyperlink r:id="rId11">
-        <w:r>
-          <w:rPr>
-            <w:color w:val="0563C1"/>
-            <w:u w:val="single"/>
-            <w:sz w:val="18"/>
-            <w:szCs w:val="18"/>
-          </w:rPr>
-          <w:t xml:space="preserve">Portfolio</w:t>
-        </w:r>
-      </w:hyperlink>
     </w:p>
     <w:p>
       <w:pPr>
@@ -769,48 +758,6 @@
         </w:r>
       </w:hyperlink>
     </w:p>
-    <w:p>
-      <w:pPr>
-        <w:spacing w:after="0" w:before="40"/>
-        <w:jc w:val="center"/>
-      </w:pPr>
-      <w:r>
-        <w:rPr>
-          <w:b w:val="0"/>
-          <w:sz w:val="16"/>
-        </w:rPr>
-        <w:t xml:space="preserve">GitLab: </w:t>
-      </w:r>
-      <w:hyperlink r:id="rId10">
-        <w:r>
-          <w:rPr>
-            <w:color w:val="0563C1"/>
-            <w:u w:val="single"/>
-            <w:sz w:val="16"/>
-            <w:szCs w:val="16"/>
-          </w:rPr>
-          <w:t xml:space="preserve">gitlab.com/ansht_121</w:t>
-        </w:r>
-      </w:hyperlink>
-      <w:r>
-        <w:rPr>
-          <w:b w:val="0"/>
-          <w:sz w:val="16"/>
-        </w:rPr>
-        <w:t xml:space="preserve">  |  Portfolio: </w:t>
-      </w:r>
-      <w:hyperlink r:id="rId11">
-        <w:r>
-          <w:rPr>
-            <w:color w:val="0563C1"/>
-            <w:u w:val="single"/>
-            <w:sz w:val="16"/>
-            <w:szCs w:val="16"/>
-          </w:rPr>
-          <w:t xml:space="preserve">ansh-thakur.netlify.app</w:t>
-        </w:r>
-      </w:hyperlink>
-    </w:p>
     <w:sectPr>
       <w:pgSz w:w="12240" w:h="15840"/>
       <w:pgMar w:top="576" w:right="720" w:bottom="576" w:left="720" w:header="720" w:footer="720" w:gutter="0"/>

</xml_diff>